<commit_message>
Update SigCore UC development and release system
</commit_message>
<xml_diff>
--- a/docs/Press Material/Universal Controller.docx
+++ b/docs/Press Material/Universal Controller.docx
@@ -12,7 +12,7 @@
           <w:noProof/>
         </w:rPr>
         <w:drawing>
-          <wp:inline distT="0" distB="0" distL="0" distR="0" wp14:anchorId="062BF4A4" wp14:editId="663DF45C">
+          <wp:inline distT="0" distB="0" distL="0" distR="0" wp14:anchorId="062BF4A4" wp14:editId="01242CC3">
             <wp:extent cx="2167204" cy="979714"/>
             <wp:effectExtent l="0" t="0" r="0" b="0"/>
             <wp:docPr id="2020252555" name="Picture 1"/>
@@ -165,17 +165,248 @@
           <w:sz w:val="40"/>
           <w:szCs w:val="40"/>
         </w:rPr>
-        <w:t xml:space="preserve">A </w:t>
-      </w:r>
-      <w:r>
+        <w:t>A Complete Test Control and Data Logging System</w:t>
+      </w:r>
+    </w:p>
+    <w:p>
+      <w:pPr>
+        <w:rPr>
+          <w:sz w:val="28"/>
+          <w:szCs w:val="28"/>
+        </w:rPr>
+      </w:pPr>
+      <w:r>
+        <w:rPr>
+          <w:sz w:val="28"/>
+          <w:szCs w:val="28"/>
+        </w:rPr>
+        <w:t>SigCore UC is a general-purpose test controller designed for real-world test setups. Unlike development boards or expansion modules, it’s a complete, ready-to-deploy system that combines control, data collection, and test execution in a single package</w:t>
+      </w:r>
+      <w:r>
+        <w:rPr>
+          <w:sz w:val="28"/>
+          <w:szCs w:val="28"/>
+        </w:rPr>
+        <w:t>.</w:t>
+      </w:r>
+    </w:p>
+    <w:p>
+      <w:pPr>
+        <w:pStyle w:val="ListParagraph"/>
+        <w:numPr>
+          <w:ilvl w:val="0"/>
+          <w:numId w:val="3"/>
+        </w:numPr>
+        <w:rPr>
+          <w:sz w:val="28"/>
+          <w:szCs w:val="28"/>
+        </w:rPr>
+      </w:pPr>
+      <w:r>
+        <w:rPr>
+          <w:sz w:val="28"/>
+          <w:szCs w:val="28"/>
+        </w:rPr>
+        <w:t xml:space="preserve">Set up and run tests quickly without complex setup </w:t>
+      </w:r>
+    </w:p>
+    <w:p>
+      <w:pPr>
+        <w:pStyle w:val="ListParagraph"/>
+        <w:numPr>
+          <w:ilvl w:val="0"/>
+          <w:numId w:val="3"/>
+        </w:numPr>
+        <w:rPr>
+          <w:sz w:val="28"/>
+          <w:szCs w:val="28"/>
+        </w:rPr>
+      </w:pPr>
+      <w:r>
+        <w:rPr>
+          <w:sz w:val="28"/>
+          <w:szCs w:val="28"/>
+        </w:rPr>
+        <w:t xml:space="preserve">No programming required for basic test execution </w:t>
+      </w:r>
+    </w:p>
+    <w:p>
+      <w:pPr>
+        <w:pStyle w:val="ListParagraph"/>
+        <w:numPr>
+          <w:ilvl w:val="0"/>
+          <w:numId w:val="3"/>
+        </w:numPr>
+        <w:rPr>
+          <w:sz w:val="28"/>
+          <w:szCs w:val="28"/>
+        </w:rPr>
+      </w:pPr>
+      <w:r>
+        <w:rPr>
+          <w:sz w:val="28"/>
+          <w:szCs w:val="28"/>
+        </w:rPr>
+        <w:t xml:space="preserve">Run real-world test setups, including lab and validation systems </w:t>
+      </w:r>
+    </w:p>
+    <w:p>
+      <w:pPr>
+        <w:pStyle w:val="ListParagraph"/>
+        <w:numPr>
+          <w:ilvl w:val="0"/>
+          <w:numId w:val="3"/>
+        </w:numPr>
+        <w:rPr>
+          <w:sz w:val="28"/>
+          <w:szCs w:val="28"/>
+        </w:rPr>
+      </w:pPr>
+      <w:r>
+        <w:rPr>
+          <w:sz w:val="28"/>
+          <w:szCs w:val="28"/>
+        </w:rPr>
+        <w:t xml:space="preserve">Capture and log test data automatically </w:t>
+      </w:r>
+    </w:p>
+    <w:p>
+      <w:pPr>
+        <w:pStyle w:val="ListParagraph"/>
+        <w:numPr>
+          <w:ilvl w:val="0"/>
+          <w:numId w:val="3"/>
+        </w:numPr>
+        <w:rPr>
+          <w:sz w:val="28"/>
+          <w:szCs w:val="28"/>
+        </w:rPr>
+      </w:pPr>
+      <w:r>
+        <w:rPr>
+          <w:sz w:val="28"/>
+          <w:szCs w:val="28"/>
+        </w:rPr>
+        <w:t xml:space="preserve">Replace multi-tool setups with a single system </w:t>
+      </w:r>
+    </w:p>
+    <w:p>
+      <w:pPr>
+        <w:pStyle w:val="ListParagraph"/>
+        <w:numPr>
+          <w:ilvl w:val="0"/>
+          <w:numId w:val="3"/>
+        </w:numPr>
+        <w:rPr>
+          <w:sz w:val="28"/>
+          <w:szCs w:val="28"/>
+        </w:rPr>
+      </w:pPr>
+      <w:r>
+        <w:rPr>
+          <w:sz w:val="28"/>
+          <w:szCs w:val="28"/>
+        </w:rPr>
+        <w:t xml:space="preserve">Build custom test sequences when needed </w:t>
+      </w:r>
+    </w:p>
+    <w:p>
+      <w:pPr>
+        <w:rPr>
+          <w:sz w:val="28"/>
+          <w:szCs w:val="28"/>
+        </w:rPr>
+      </w:pPr>
+      <w:r>
+        <w:rPr>
+          <w:sz w:val="28"/>
+          <w:szCs w:val="28"/>
+        </w:rPr>
+        <w:br w:type="page"/>
+      </w:r>
+    </w:p>
+    <w:p>
+      <w:pPr>
+        <w:rPr>
+          <w:sz w:val="28"/>
+          <w:szCs w:val="28"/>
+        </w:rPr>
+      </w:pPr>
+      <w:r>
+        <w:rPr>
+          <w:noProof/>
+          <w:sz w:val="28"/>
+          <w:szCs w:val="28"/>
+        </w:rPr>
+        <w:lastRenderedPageBreak/>
+        <w:drawing>
+          <wp:inline distT="0" distB="0" distL="0" distR="0" wp14:anchorId="1919A5CD" wp14:editId="264943C8">
+            <wp:extent cx="5937885" cy="4149725"/>
+            <wp:effectExtent l="0" t="0" r="5715" b="3175"/>
+            <wp:docPr id="1848555505" name="Picture 1"/>
+            <wp:cNvGraphicFramePr>
+              <a:graphicFrameLocks xmlns:a="http://schemas.openxmlformats.org/drawingml/2006/main" noChangeAspect="1"/>
+            </wp:cNvGraphicFramePr>
+            <a:graphic xmlns:a="http://schemas.openxmlformats.org/drawingml/2006/main">
+              <a:graphicData uri="http://schemas.openxmlformats.org/drawingml/2006/picture">
+                <pic:pic xmlns:pic="http://schemas.openxmlformats.org/drawingml/2006/picture">
+                  <pic:nvPicPr>
+                    <pic:cNvPr id="0" name="Picture 1"/>
+                    <pic:cNvPicPr>
+                      <a:picLocks noChangeAspect="1" noChangeArrowheads="1"/>
+                    </pic:cNvPicPr>
+                  </pic:nvPicPr>
+                  <pic:blipFill>
+                    <a:blip r:embed="rId7" cstate="print">
+                      <a:extLst>
+                        <a:ext uri="{28A0092B-C50C-407E-A947-70E740481C1C}">
+                          <a14:useLocalDpi xmlns:a14="http://schemas.microsoft.com/office/drawing/2010/main" val="0"/>
+                        </a:ext>
+                      </a:extLst>
+                    </a:blip>
+                    <a:srcRect/>
+                    <a:stretch>
+                      <a:fillRect/>
+                    </a:stretch>
+                  </pic:blipFill>
+                  <pic:spPr bwMode="auto">
+                    <a:xfrm>
+                      <a:off x="0" y="0"/>
+                      <a:ext cx="5937885" cy="4149725"/>
+                    </a:xfrm>
+                    <a:prstGeom prst="rect">
+                      <a:avLst/>
+                    </a:prstGeom>
+                    <a:noFill/>
+                    <a:ln>
+                      <a:noFill/>
+                    </a:ln>
+                  </pic:spPr>
+                </pic:pic>
+              </a:graphicData>
+            </a:graphic>
+          </wp:inline>
+        </w:drawing>
+      </w:r>
+    </w:p>
+    <w:p>
+      <w:pPr>
+        <w:rPr>
+          <w:sz w:val="28"/>
+          <w:szCs w:val="28"/>
+        </w:rPr>
+      </w:pPr>
+    </w:p>
+    <w:p>
+      <w:pPr>
+        <w:jc w:val="center"/>
         <w:rPr>
           <w:i/>
           <w:iCs/>
           <w:sz w:val="40"/>
           <w:szCs w:val="40"/>
         </w:rPr>
-        <w:t>C</w:t>
-      </w:r>
+      </w:pPr>
       <w:r>
         <w:rPr>
           <w:i/>
@@ -183,128 +414,62 @@
           <w:sz w:val="40"/>
           <w:szCs w:val="40"/>
         </w:rPr>
-        <w:t xml:space="preserve">omplete </w:t>
-      </w:r>
-      <w:r>
-        <w:rPr>
-          <w:i/>
-          <w:iCs/>
-          <w:sz w:val="40"/>
-          <w:szCs w:val="40"/>
-        </w:rPr>
-        <w:t>I</w:t>
-      </w:r>
-      <w:r>
-        <w:rPr>
-          <w:i/>
-          <w:iCs/>
-          <w:sz w:val="40"/>
-          <w:szCs w:val="40"/>
-        </w:rPr>
-        <w:t xml:space="preserve">ndustrial </w:t>
-      </w:r>
-      <w:r>
-        <w:rPr>
-          <w:i/>
-          <w:iCs/>
-          <w:sz w:val="40"/>
-          <w:szCs w:val="40"/>
-        </w:rPr>
-        <w:t>C</w:t>
-      </w:r>
-      <w:r>
-        <w:rPr>
-          <w:i/>
-          <w:iCs/>
-          <w:sz w:val="40"/>
-          <w:szCs w:val="40"/>
-        </w:rPr>
-        <w:t xml:space="preserve">ontrol and </w:t>
-      </w:r>
-      <w:r>
-        <w:rPr>
-          <w:i/>
-          <w:iCs/>
-          <w:sz w:val="40"/>
-          <w:szCs w:val="40"/>
-        </w:rPr>
-        <w:t>D</w:t>
-      </w:r>
-      <w:r>
-        <w:rPr>
-          <w:i/>
-          <w:iCs/>
-          <w:sz w:val="40"/>
-          <w:szCs w:val="40"/>
-        </w:rPr>
-        <w:t xml:space="preserve">ata </w:t>
-      </w:r>
-      <w:r>
-        <w:rPr>
-          <w:i/>
-          <w:iCs/>
-          <w:sz w:val="40"/>
-          <w:szCs w:val="40"/>
-        </w:rPr>
-        <w:t>C</w:t>
-      </w:r>
-      <w:r>
-        <w:rPr>
-          <w:i/>
-          <w:iCs/>
-          <w:sz w:val="40"/>
-          <w:szCs w:val="40"/>
-        </w:rPr>
-        <w:t xml:space="preserve">ollection </w:t>
-      </w:r>
-      <w:r>
-        <w:rPr>
-          <w:i/>
-          <w:iCs/>
-          <w:sz w:val="40"/>
-          <w:szCs w:val="40"/>
-        </w:rPr>
-        <w:t>S</w:t>
-      </w:r>
-      <w:r>
-        <w:rPr>
-          <w:i/>
-          <w:iCs/>
-          <w:sz w:val="40"/>
-          <w:szCs w:val="40"/>
-        </w:rPr>
-        <w:t>ystem</w:t>
+        <w:t>Built for Real-World Test and Control Applications</w:t>
       </w:r>
     </w:p>
     <w:p>
       <w:pPr>
         <w:rPr>
-          <w:sz w:val="24"/>
-          <w:szCs w:val="24"/>
+          <w:sz w:val="28"/>
+          <w:szCs w:val="28"/>
+        </w:rPr>
+      </w:pPr>
+      <w:r>
+        <w:rPr>
+          <w:sz w:val="28"/>
+          <w:szCs w:val="28"/>
+        </w:rPr>
+        <w:t>SigCore UC is designed for engineers who need to set up and run real test systems without unnecessary complexity. It combines control, data collection, and test execution in a single device, eliminating the need to stitch together multiple tools. Whether you’re working in a lab, validating a product, or building a test bench, SigCore UC gives you direct, reliable control with integrated data logging.</w:t>
+      </w:r>
+    </w:p>
+    <w:p>
+      <w:pPr>
+        <w:tabs>
+          <w:tab w:val="num" w:pos="720"/>
+        </w:tabs>
+        <w:rPr>
+          <w:sz w:val="28"/>
+          <w:szCs w:val="28"/>
         </w:rPr>
       </w:pPr>
       <w:r>
         <w:rPr>
           <w:b/>
           <w:bCs/>
-          <w:sz w:val="24"/>
-          <w:szCs w:val="24"/>
-        </w:rPr>
-        <w:t>SigCore UC</w:t>
-      </w:r>
-      <w:r>
-        <w:rPr>
-          <w:sz w:val="24"/>
-          <w:szCs w:val="24"/>
-        </w:rPr>
-        <w:t xml:space="preserve"> is a fully functional industrial control and data collection system. Unlike development boards or expansion modules, SigCore UC is a complete, ready-to-deploy solution — combining rugged hardware with powerful software in one package</w:t>
-      </w:r>
-      <w:r>
-        <w:rPr>
-          <w:sz w:val="24"/>
-          <w:szCs w:val="24"/>
-        </w:rPr>
-        <w:t>.</w:t>
+          <w:sz w:val="28"/>
+          <w:szCs w:val="28"/>
+        </w:rPr>
+        <w:t xml:space="preserve">What </w:t>
+      </w:r>
+      <w:proofErr w:type="gramStart"/>
+      <w:r>
+        <w:rPr>
+          <w:b/>
+          <w:bCs/>
+          <w:sz w:val="28"/>
+          <w:szCs w:val="28"/>
+        </w:rPr>
+        <w:t>you can</w:t>
+      </w:r>
+      <w:proofErr w:type="gramEnd"/>
+      <w:r>
+        <w:rPr>
+          <w:b/>
+          <w:bCs/>
+          <w:sz w:val="28"/>
+          <w:szCs w:val="28"/>
+        </w:rPr>
+        <w:t xml:space="preserve"> do with it:</w:t>
       </w:r>
     </w:p>
     <w:p>
@@ -312,7 +477,7 @@
         <w:pStyle w:val="ListParagraph"/>
         <w:numPr>
           <w:ilvl w:val="0"/>
-          <w:numId w:val="1"/>
+          <w:numId w:val="5"/>
         </w:numPr>
         <w:rPr>
           <w:sz w:val="24"/>
@@ -321,19 +486,10 @@
       </w:pPr>
       <w:r>
         <w:rPr>
-          <w:b/>
-          <w:bCs/>
-          <w:sz w:val="24"/>
-          <w:szCs w:val="24"/>
-        </w:rPr>
-        <w:t>8 Relay Outputs</w:t>
-      </w:r>
-      <w:r>
-        <w:rPr>
-          <w:sz w:val="24"/>
-          <w:szCs w:val="24"/>
-        </w:rPr>
-        <w:t xml:space="preserve"> – switch equipment and high-current loads</w:t>
+          <w:sz w:val="24"/>
+          <w:szCs w:val="24"/>
+        </w:rPr>
+        <w:t xml:space="preserve">Read sensors and signals using analog and digital inputs </w:t>
       </w:r>
     </w:p>
     <w:p>
@@ -341,7 +497,7 @@
         <w:pStyle w:val="ListParagraph"/>
         <w:numPr>
           <w:ilvl w:val="0"/>
-          <w:numId w:val="1"/>
+          <w:numId w:val="5"/>
         </w:numPr>
         <w:rPr>
           <w:sz w:val="24"/>
@@ -350,19 +506,10 @@
       </w:pPr>
       <w:r>
         <w:rPr>
-          <w:b/>
-          <w:bCs/>
-          <w:sz w:val="24"/>
-          <w:szCs w:val="24"/>
-        </w:rPr>
-        <w:t>8 Universal Digital Inputs</w:t>
-      </w:r>
-      <w:r>
-        <w:rPr>
-          <w:sz w:val="24"/>
-          <w:szCs w:val="24"/>
-        </w:rPr>
-        <w:t xml:space="preserve"> – ON: 2–24 VDC, OFF: 0–0.5 VDC</w:t>
+          <w:sz w:val="24"/>
+          <w:szCs w:val="24"/>
+        </w:rPr>
+        <w:t xml:space="preserve">Control equipment and loads using relay and analog outputs </w:t>
       </w:r>
     </w:p>
     <w:p>
@@ -370,7 +517,7 @@
         <w:pStyle w:val="ListParagraph"/>
         <w:numPr>
           <w:ilvl w:val="0"/>
-          <w:numId w:val="1"/>
+          <w:numId w:val="5"/>
         </w:numPr>
         <w:rPr>
           <w:sz w:val="24"/>
@@ -379,19 +526,10 @@
       </w:pPr>
       <w:r>
         <w:rPr>
-          <w:b/>
-          <w:bCs/>
-          <w:sz w:val="24"/>
-          <w:szCs w:val="24"/>
-        </w:rPr>
-        <w:t>4 Calibrated Analog Inputs</w:t>
-      </w:r>
-      <w:r>
-        <w:rPr>
-          <w:sz w:val="24"/>
-          <w:szCs w:val="24"/>
-        </w:rPr>
-        <w:t xml:space="preserve"> – voltage or current, with filtering and engineering units</w:t>
+          <w:sz w:val="24"/>
+          <w:szCs w:val="24"/>
+        </w:rPr>
+        <w:t xml:space="preserve">Run test sequences to automate test procedures </w:t>
       </w:r>
     </w:p>
     <w:p>
@@ -399,7 +537,7 @@
         <w:pStyle w:val="ListParagraph"/>
         <w:numPr>
           <w:ilvl w:val="0"/>
-          <w:numId w:val="1"/>
+          <w:numId w:val="5"/>
         </w:numPr>
         <w:rPr>
           <w:sz w:val="24"/>
@@ -408,19 +546,10 @@
       </w:pPr>
       <w:r>
         <w:rPr>
-          <w:b/>
-          <w:bCs/>
-          <w:sz w:val="24"/>
-          <w:szCs w:val="24"/>
-        </w:rPr>
-        <w:t>4 Analog Outputs</w:t>
-      </w:r>
-      <w:r>
-        <w:rPr>
-          <w:sz w:val="24"/>
-          <w:szCs w:val="24"/>
-        </w:rPr>
-        <w:t xml:space="preserve"> – voltage or PWM</w:t>
+          <w:sz w:val="24"/>
+          <w:szCs w:val="24"/>
+        </w:rPr>
+        <w:t xml:space="preserve">Log test data for analysis and validation </w:t>
       </w:r>
     </w:p>
     <w:p>
@@ -428,7 +557,7 @@
         <w:pStyle w:val="ListParagraph"/>
         <w:numPr>
           <w:ilvl w:val="0"/>
-          <w:numId w:val="1"/>
+          <w:numId w:val="5"/>
         </w:numPr>
         <w:rPr>
           <w:sz w:val="24"/>
@@ -437,19 +566,10 @@
       </w:pPr>
       <w:r>
         <w:rPr>
-          <w:b/>
-          <w:bCs/>
-          <w:sz w:val="24"/>
-          <w:szCs w:val="24"/>
-        </w:rPr>
-        <w:t>Built-in PID Control Loops</w:t>
-      </w:r>
-      <w:r>
-        <w:rPr>
-          <w:sz w:val="24"/>
-          <w:szCs w:val="24"/>
-        </w:rPr>
-        <w:t xml:space="preserve"> – no extra coding required</w:t>
+          <w:sz w:val="24"/>
+          <w:szCs w:val="24"/>
+        </w:rPr>
+        <w:t xml:space="preserve">Monitor and adjust systems in real time </w:t>
       </w:r>
     </w:p>
     <w:p>
@@ -457,8 +577,23 @@
         <w:pStyle w:val="ListParagraph"/>
         <w:numPr>
           <w:ilvl w:val="0"/>
-          <w:numId w:val="1"/>
+          <w:numId w:val="5"/>
         </w:numPr>
+      </w:pPr>
+      <w:r>
+        <w:rPr>
+          <w:sz w:val="24"/>
+          <w:szCs w:val="24"/>
+        </w:rPr>
+        <w:t xml:space="preserve">Integrate with external systems using standard interfaces </w:t>
+      </w:r>
+      <w:r>
+        <w:br w:type="page"/>
+      </w:r>
+    </w:p>
+    <w:p>
+      <w:pPr>
+        <w:spacing w:after="0"/>
         <w:rPr>
           <w:sz w:val="24"/>
           <w:szCs w:val="24"/>
@@ -471,23 +606,36 @@
           <w:sz w:val="24"/>
           <w:szCs w:val="24"/>
         </w:rPr>
-        <w:t>Modbus TCP Server</w:t>
-      </w:r>
-      <w:r>
-        <w:rPr>
-          <w:sz w:val="24"/>
-          <w:szCs w:val="24"/>
-        </w:rPr>
-        <w:t xml:space="preserve"> – plus .NET and Python libraries</w:t>
+        <w:lastRenderedPageBreak/>
+        <w:t>Evaluation units are available now</w:t>
+      </w:r>
+      <w:r>
+        <w:rPr>
+          <w:sz w:val="24"/>
+          <w:szCs w:val="24"/>
+        </w:rPr>
+        <w:t>.</w:t>
       </w:r>
     </w:p>
     <w:p>
       <w:pPr>
-        <w:pStyle w:val="ListParagraph"/>
-        <w:numPr>
-          <w:ilvl w:val="0"/>
-          <w:numId w:val="1"/>
-        </w:numPr>
+        <w:spacing w:after="0"/>
+        <w:rPr>
+          <w:sz w:val="24"/>
+          <w:szCs w:val="24"/>
+        </w:rPr>
+      </w:pPr>
+      <w:r>
+        <w:rPr>
+          <w:sz w:val="24"/>
+          <w:szCs w:val="24"/>
+        </w:rPr>
+        <w:t>For review samples, specs, and high-resolution images, please contact:</w:t>
+      </w:r>
+    </w:p>
+    <w:p>
+      <w:pPr>
+        <w:ind w:left="720"/>
         <w:rPr>
           <w:sz w:val="24"/>
           <w:szCs w:val="24"/>
@@ -500,28 +648,8 @@
           <w:sz w:val="24"/>
           <w:szCs w:val="24"/>
         </w:rPr>
-        <w:t>Control Panel Software</w:t>
-      </w:r>
-      <w:r>
-        <w:rPr>
-          <w:sz w:val="24"/>
-          <w:szCs w:val="24"/>
-        </w:rPr>
-        <w:t xml:space="preserve"> – full operational control, including PID settings</w:t>
-      </w:r>
-    </w:p>
-    <w:p>
-      <w:pPr>
-        <w:pStyle w:val="ListParagraph"/>
-        <w:numPr>
-          <w:ilvl w:val="0"/>
-          <w:numId w:val="1"/>
-        </w:numPr>
-        <w:rPr>
-          <w:sz w:val="24"/>
-          <w:szCs w:val="24"/>
-        </w:rPr>
-      </w:pPr>
+        <w:t>Edward Schmitz</w:t>
+      </w:r>
       <w:r>
         <w:rPr>
           <w:b/>
@@ -529,81 +657,6 @@
           <w:sz w:val="24"/>
           <w:szCs w:val="24"/>
         </w:rPr>
-        <w:t>Data Logging</w:t>
-      </w:r>
-      <w:r>
-        <w:rPr>
-          <w:sz w:val="24"/>
-          <w:szCs w:val="24"/>
-        </w:rPr>
-        <w:t xml:space="preserve"> – record process data for analysis and optimization</w:t>
-      </w:r>
-    </w:p>
-    <w:p>
-      <w:pPr>
-        <w:spacing w:after="0"/>
-        <w:rPr>
-          <w:sz w:val="24"/>
-          <w:szCs w:val="24"/>
-        </w:rPr>
-      </w:pPr>
-      <w:r>
-        <w:rPr>
-          <w:b/>
-          <w:bCs/>
-          <w:sz w:val="24"/>
-          <w:szCs w:val="24"/>
-        </w:rPr>
-        <w:t>Evaluation units are available now</w:t>
-      </w:r>
-      <w:r>
-        <w:rPr>
-          <w:sz w:val="24"/>
-          <w:szCs w:val="24"/>
-        </w:rPr>
-        <w:t>.</w:t>
-      </w:r>
-    </w:p>
-    <w:p>
-      <w:pPr>
-        <w:spacing w:after="0"/>
-        <w:rPr>
-          <w:sz w:val="24"/>
-          <w:szCs w:val="24"/>
-        </w:rPr>
-      </w:pPr>
-      <w:r>
-        <w:rPr>
-          <w:sz w:val="24"/>
-          <w:szCs w:val="24"/>
-        </w:rPr>
-        <w:t>For review samples, specs, and high-resolution images, please contact:</w:t>
-      </w:r>
-    </w:p>
-    <w:p>
-      <w:pPr>
-        <w:ind w:left="720"/>
-        <w:rPr>
-          <w:sz w:val="24"/>
-          <w:szCs w:val="24"/>
-        </w:rPr>
-      </w:pPr>
-      <w:r>
-        <w:rPr>
-          <w:b/>
-          <w:bCs/>
-          <w:sz w:val="24"/>
-          <w:szCs w:val="24"/>
-        </w:rPr>
-        <w:t>Edward Schmitz</w:t>
-      </w:r>
-      <w:r>
-        <w:rPr>
-          <w:b/>
-          <w:bCs/>
-          <w:sz w:val="24"/>
-          <w:szCs w:val="24"/>
-        </w:rPr>
         <w:br/>
       </w:r>
       <w:r>
@@ -621,12 +674,37 @@
         </w:rPr>
         <w:t xml:space="preserve"> </w:t>
       </w:r>
-      <w:r>
-        <w:rPr>
-          <w:sz w:val="24"/>
-          <w:szCs w:val="24"/>
-        </w:rPr>
-        <w:t>en Z em | SigCore UC</w:t>
+      <w:proofErr w:type="spellStart"/>
+      <w:r>
+        <w:rPr>
+          <w:sz w:val="24"/>
+          <w:szCs w:val="24"/>
+        </w:rPr>
+        <w:t>en</w:t>
+      </w:r>
+      <w:proofErr w:type="spellEnd"/>
+      <w:r>
+        <w:rPr>
+          <w:sz w:val="24"/>
+          <w:szCs w:val="24"/>
+        </w:rPr>
+        <w:t xml:space="preserve"> Z </w:t>
+      </w:r>
+      <w:proofErr w:type="spellStart"/>
+      <w:r>
+        <w:rPr>
+          <w:sz w:val="24"/>
+          <w:szCs w:val="24"/>
+        </w:rPr>
+        <w:t>em</w:t>
+      </w:r>
+      <w:proofErr w:type="spellEnd"/>
+      <w:r>
+        <w:rPr>
+          <w:sz w:val="24"/>
+          <w:szCs w:val="24"/>
+        </w:rPr>
+        <w:t xml:space="preserve"> | SigCore UC</w:t>
       </w:r>
       <w:r>
         <w:rPr>
@@ -714,65 +792,11 @@
           <w:szCs w:val="24"/>
         </w:rPr>
         <w:t>https://sigcoreuc.com</w:t>
-      </w:r>
-    </w:p>
-    <w:p>
-      <w:pPr>
-        <w:jc w:val="center"/>
-        <w:rPr>
-          <w:color w:val="275317" w:themeColor="accent6" w:themeShade="80"/>
-          <w:sz w:val="24"/>
-          <w:szCs w:val="24"/>
-        </w:rPr>
-      </w:pPr>
-      <w:r>
-        <w:rPr>
-          <w:b/>
-          <w:bCs/>
-          <w:color w:val="275317" w:themeColor="accent6" w:themeShade="80"/>
-          <w:sz w:val="24"/>
-          <w:szCs w:val="24"/>
-        </w:rPr>
-        <w:t>________________________________________________________________________</w:t>
-      </w:r>
-      <w:r>
-        <w:rPr>
-          <w:b/>
-          <w:bCs/>
-          <w:color w:val="275317" w:themeColor="accent6" w:themeShade="80"/>
-          <w:sz w:val="24"/>
-          <w:szCs w:val="24"/>
-        </w:rPr>
-        <w:br/>
-      </w:r>
-      <w:r>
-        <w:rPr>
-          <w:color w:val="275317" w:themeColor="accent6" w:themeShade="80"/>
-          <w:sz w:val="24"/>
-          <w:szCs w:val="24"/>
-        </w:rPr>
-        <w:t>sigcore</w:t>
-      </w:r>
-      <w:r>
-        <w:rPr>
-          <w:color w:val="275317" w:themeColor="accent6" w:themeShade="80"/>
-          <w:sz w:val="24"/>
-          <w:szCs w:val="24"/>
-        </w:rPr>
-        <w:t>uc</w:t>
-      </w:r>
-      <w:r>
-        <w:rPr>
-          <w:color w:val="275317" w:themeColor="accent6" w:themeShade="80"/>
-          <w:sz w:val="24"/>
-          <w:szCs w:val="24"/>
-        </w:rPr>
-        <w:t>.com</w:t>
       </w:r>
     </w:p>
     <w:sectPr>
       <w:pgSz w:w="12240" w:h="15840"/>
-      <w:pgMar w:top="720" w:right="720" w:bottom="288" w:left="720" w:header="720" w:footer="720" w:gutter="0"/>
+      <w:pgMar w:top="1440" w:right="1440" w:bottom="1440" w:left="1440" w:header="720" w:footer="720" w:gutter="0"/>
       <w:cols w:space="720"/>
       <w:docGrid w:linePitch="360"/>
     </w:sectPr>
@@ -783,6 +807,268 @@
 <file path=word/numbering.xml><?xml version="1.0" encoding="utf-8"?>
 <w:numbering xmlns:wpc="http://schemas.microsoft.com/office/word/2010/wordprocessingCanvas" xmlns:cx="http://schemas.microsoft.com/office/drawing/2014/chartex" xmlns:cx1="http://schemas.microsoft.com/office/drawing/2015/9/8/chartex" xmlns:cx2="http://schemas.microsoft.com/office/drawing/2015/10/21/chartex" xmlns:cx3="http://schemas.microsoft.com/office/drawing/2016/5/9/chartex" xmlns:cx4="http://schemas.microsoft.com/office/drawing/2016/5/10/chartex" xmlns:cx5="http://schemas.microsoft.com/office/drawing/2016/5/11/chartex" xmlns:cx6="http://schemas.microsoft.com/office/drawing/2016/5/12/chartex" xmlns:cx7="http://schemas.microsoft.com/office/drawing/2016/5/13/chartex" xmlns:cx8="http://schemas.microsoft.com/office/drawing/2016/5/14/chartex" xmlns:mc="http://schemas.openxmlformats.org/markup-compatibility/2006" xmlns:aink="http://schemas.microsoft.com/office/drawing/2016/ink" xmlns:am3d="http://schemas.microsoft.com/office/drawing/2017/model3d" xmlns:o="urn:schemas-microsoft-com:office:office" xmlns:oel="http://schemas.microsoft.com/office/2019/extlst" xmlns:r="http://schemas.openxmlformats.org/officeDocument/2006/relationships" xmlns:m="http://schemas.openxmlformats.org/officeDocument/2006/math" xmlns:v="urn:schemas-microsoft-com:vml" xmlns:wp14="http://schemas.microsoft.com/office/word/2010/wordprocessingDrawing" xmlns:wp="http://schemas.openxmlformats.org/drawingml/2006/wordprocessingDrawing" xmlns:w10="urn:schemas-microsoft-com:office:word" xmlns:w="http://schemas.openxmlformats.org/wordprocessingml/2006/main" xmlns:w14="http://schemas.microsoft.com/office/word/2010/wordml" xmlns:w15="http://schemas.microsoft.com/office/word/2012/wordml" xmlns:w16cex="http://schemas.microsoft.com/office/word/2018/wordml/cex" xmlns:w16cid="http://schemas.microsoft.com/office/word/2016/wordml/cid" xmlns:w16="http://schemas.microsoft.com/office/word/2018/wordml" xmlns:w16du="http://schemas.microsoft.com/office/word/2023/wordml/word16du" xmlns:w16sdtdh="http://schemas.microsoft.com/office/word/2020/wordml/sdtdatahash" xmlns:w16sdtfl="http://schemas.microsoft.com/office/word/2024/wordml/sdtformatlock" xmlns:w16se="http://schemas.microsoft.com/office/word/2015/wordml/symex" xmlns:wpg="http://schemas.microsoft.com/office/word/2010/wordprocessingGroup" xmlns:wpi="http://schemas.microsoft.com/office/word/2010/wordprocessingInk" xmlns:wne="http://schemas.microsoft.com/office/word/2006/wordml" xmlns:wps="http://schemas.microsoft.com/office/word/2010/wordprocessingShape" mc:Ignorable="w14 w15 w16se w16cid w16 w16cex w16sdtdh w16sdtfl w16du wp14">
   <w:abstractNum w:abstractNumId="0" w15:restartNumberingAfterBreak="0">
+    <w:nsid w:val="0B200A35"/>
+    <w:multiLevelType w:val="hybridMultilevel"/>
+    <w:tmpl w:val="8D3A6422"/>
+    <w:lvl w:ilvl="0" w:tplc="04090001">
+      <w:start w:val="1"/>
+      <w:numFmt w:val="bullet"/>
+      <w:lvlText w:val=""/>
+      <w:lvlJc w:val="left"/>
+      <w:pPr>
+        <w:ind w:left="720" w:hanging="360"/>
+      </w:pPr>
+      <w:rPr>
+        <w:rFonts w:ascii="Symbol" w:hAnsi="Symbol" w:hint="default"/>
+      </w:rPr>
+    </w:lvl>
+    <w:lvl w:ilvl="1" w:tplc="04090003" w:tentative="1">
+      <w:start w:val="1"/>
+      <w:numFmt w:val="bullet"/>
+      <w:lvlText w:val="o"/>
+      <w:lvlJc w:val="left"/>
+      <w:pPr>
+        <w:ind w:left="1440" w:hanging="360"/>
+      </w:pPr>
+      <w:rPr>
+        <w:rFonts w:ascii="Courier New" w:hAnsi="Courier New" w:cs="Courier New" w:hint="default"/>
+      </w:rPr>
+    </w:lvl>
+    <w:lvl w:ilvl="2" w:tplc="04090005" w:tentative="1">
+      <w:start w:val="1"/>
+      <w:numFmt w:val="bullet"/>
+      <w:lvlText w:val=""/>
+      <w:lvlJc w:val="left"/>
+      <w:pPr>
+        <w:ind w:left="2160" w:hanging="360"/>
+      </w:pPr>
+      <w:rPr>
+        <w:rFonts w:ascii="Wingdings" w:hAnsi="Wingdings" w:hint="default"/>
+      </w:rPr>
+    </w:lvl>
+    <w:lvl w:ilvl="3" w:tplc="04090001" w:tentative="1">
+      <w:start w:val="1"/>
+      <w:numFmt w:val="bullet"/>
+      <w:lvlText w:val=""/>
+      <w:lvlJc w:val="left"/>
+      <w:pPr>
+        <w:ind w:left="2880" w:hanging="360"/>
+      </w:pPr>
+      <w:rPr>
+        <w:rFonts w:ascii="Symbol" w:hAnsi="Symbol" w:hint="default"/>
+      </w:rPr>
+    </w:lvl>
+    <w:lvl w:ilvl="4" w:tplc="04090003" w:tentative="1">
+      <w:start w:val="1"/>
+      <w:numFmt w:val="bullet"/>
+      <w:lvlText w:val="o"/>
+      <w:lvlJc w:val="left"/>
+      <w:pPr>
+        <w:ind w:left="3600" w:hanging="360"/>
+      </w:pPr>
+      <w:rPr>
+        <w:rFonts w:ascii="Courier New" w:hAnsi="Courier New" w:cs="Courier New" w:hint="default"/>
+      </w:rPr>
+    </w:lvl>
+    <w:lvl w:ilvl="5" w:tplc="04090005" w:tentative="1">
+      <w:start w:val="1"/>
+      <w:numFmt w:val="bullet"/>
+      <w:lvlText w:val=""/>
+      <w:lvlJc w:val="left"/>
+      <w:pPr>
+        <w:ind w:left="4320" w:hanging="360"/>
+      </w:pPr>
+      <w:rPr>
+        <w:rFonts w:ascii="Wingdings" w:hAnsi="Wingdings" w:hint="default"/>
+      </w:rPr>
+    </w:lvl>
+    <w:lvl w:ilvl="6" w:tplc="04090001" w:tentative="1">
+      <w:start w:val="1"/>
+      <w:numFmt w:val="bullet"/>
+      <w:lvlText w:val=""/>
+      <w:lvlJc w:val="left"/>
+      <w:pPr>
+        <w:ind w:left="5040" w:hanging="360"/>
+      </w:pPr>
+      <w:rPr>
+        <w:rFonts w:ascii="Symbol" w:hAnsi="Symbol" w:hint="default"/>
+      </w:rPr>
+    </w:lvl>
+    <w:lvl w:ilvl="7" w:tplc="04090003" w:tentative="1">
+      <w:start w:val="1"/>
+      <w:numFmt w:val="bullet"/>
+      <w:lvlText w:val="o"/>
+      <w:lvlJc w:val="left"/>
+      <w:pPr>
+        <w:ind w:left="5760" w:hanging="360"/>
+      </w:pPr>
+      <w:rPr>
+        <w:rFonts w:ascii="Courier New" w:hAnsi="Courier New" w:cs="Courier New" w:hint="default"/>
+      </w:rPr>
+    </w:lvl>
+    <w:lvl w:ilvl="8" w:tplc="04090005" w:tentative="1">
+      <w:start w:val="1"/>
+      <w:numFmt w:val="bullet"/>
+      <w:lvlText w:val=""/>
+      <w:lvlJc w:val="left"/>
+      <w:pPr>
+        <w:ind w:left="6480" w:hanging="360"/>
+      </w:pPr>
+      <w:rPr>
+        <w:rFonts w:ascii="Wingdings" w:hAnsi="Wingdings" w:hint="default"/>
+      </w:rPr>
+    </w:lvl>
+  </w:abstractNum>
+  <w:abstractNum w:abstractNumId="1" w15:restartNumberingAfterBreak="0">
+    <w:nsid w:val="27872E75"/>
+    <w:multiLevelType w:val="multilevel"/>
+    <w:tmpl w:val="F7807CDC"/>
+    <w:lvl w:ilvl="0">
+      <w:start w:val="1"/>
+      <w:numFmt w:val="bullet"/>
+      <w:lvlText w:val=""/>
+      <w:lvlJc w:val="left"/>
+      <w:pPr>
+        <w:tabs>
+          <w:tab w:val="num" w:pos="720"/>
+        </w:tabs>
+        <w:ind w:left="720" w:hanging="360"/>
+      </w:pPr>
+      <w:rPr>
+        <w:rFonts w:ascii="Symbol" w:hAnsi="Symbol" w:hint="default"/>
+        <w:sz w:val="20"/>
+      </w:rPr>
+    </w:lvl>
+    <w:lvl w:ilvl="1" w:tentative="1">
+      <w:start w:val="1"/>
+      <w:numFmt w:val="bullet"/>
+      <w:lvlText w:val="o"/>
+      <w:lvlJc w:val="left"/>
+      <w:pPr>
+        <w:tabs>
+          <w:tab w:val="num" w:pos="1440"/>
+        </w:tabs>
+        <w:ind w:left="1440" w:hanging="360"/>
+      </w:pPr>
+      <w:rPr>
+        <w:rFonts w:ascii="Courier New" w:hAnsi="Courier New" w:hint="default"/>
+        <w:sz w:val="20"/>
+      </w:rPr>
+    </w:lvl>
+    <w:lvl w:ilvl="2" w:tentative="1">
+      <w:start w:val="1"/>
+      <w:numFmt w:val="bullet"/>
+      <w:lvlText w:val=""/>
+      <w:lvlJc w:val="left"/>
+      <w:pPr>
+        <w:tabs>
+          <w:tab w:val="num" w:pos="2160"/>
+        </w:tabs>
+        <w:ind w:left="2160" w:hanging="360"/>
+      </w:pPr>
+      <w:rPr>
+        <w:rFonts w:ascii="Wingdings" w:hAnsi="Wingdings" w:hint="default"/>
+        <w:sz w:val="20"/>
+      </w:rPr>
+    </w:lvl>
+    <w:lvl w:ilvl="3" w:tentative="1">
+      <w:start w:val="1"/>
+      <w:numFmt w:val="bullet"/>
+      <w:lvlText w:val=""/>
+      <w:lvlJc w:val="left"/>
+      <w:pPr>
+        <w:tabs>
+          <w:tab w:val="num" w:pos="2880"/>
+        </w:tabs>
+        <w:ind w:left="2880" w:hanging="360"/>
+      </w:pPr>
+      <w:rPr>
+        <w:rFonts w:ascii="Wingdings" w:hAnsi="Wingdings" w:hint="default"/>
+        <w:sz w:val="20"/>
+      </w:rPr>
+    </w:lvl>
+    <w:lvl w:ilvl="4" w:tentative="1">
+      <w:start w:val="1"/>
+      <w:numFmt w:val="bullet"/>
+      <w:lvlText w:val=""/>
+      <w:lvlJc w:val="left"/>
+      <w:pPr>
+        <w:tabs>
+          <w:tab w:val="num" w:pos="3600"/>
+        </w:tabs>
+        <w:ind w:left="3600" w:hanging="360"/>
+      </w:pPr>
+      <w:rPr>
+        <w:rFonts w:ascii="Wingdings" w:hAnsi="Wingdings" w:hint="default"/>
+        <w:sz w:val="20"/>
+      </w:rPr>
+    </w:lvl>
+    <w:lvl w:ilvl="5" w:tentative="1">
+      <w:start w:val="1"/>
+      <w:numFmt w:val="bullet"/>
+      <w:lvlText w:val=""/>
+      <w:lvlJc w:val="left"/>
+      <w:pPr>
+        <w:tabs>
+          <w:tab w:val="num" w:pos="4320"/>
+        </w:tabs>
+        <w:ind w:left="4320" w:hanging="360"/>
+      </w:pPr>
+      <w:rPr>
+        <w:rFonts w:ascii="Wingdings" w:hAnsi="Wingdings" w:hint="default"/>
+        <w:sz w:val="20"/>
+      </w:rPr>
+    </w:lvl>
+    <w:lvl w:ilvl="6" w:tentative="1">
+      <w:start w:val="1"/>
+      <w:numFmt w:val="bullet"/>
+      <w:lvlText w:val=""/>
+      <w:lvlJc w:val="left"/>
+      <w:pPr>
+        <w:tabs>
+          <w:tab w:val="num" w:pos="5040"/>
+        </w:tabs>
+        <w:ind w:left="5040" w:hanging="360"/>
+      </w:pPr>
+      <w:rPr>
+        <w:rFonts w:ascii="Wingdings" w:hAnsi="Wingdings" w:hint="default"/>
+        <w:sz w:val="20"/>
+      </w:rPr>
+    </w:lvl>
+    <w:lvl w:ilvl="7" w:tentative="1">
+      <w:start w:val="1"/>
+      <w:numFmt w:val="bullet"/>
+      <w:lvlText w:val=""/>
+      <w:lvlJc w:val="left"/>
+      <w:pPr>
+        <w:tabs>
+          <w:tab w:val="num" w:pos="5760"/>
+        </w:tabs>
+        <w:ind w:left="5760" w:hanging="360"/>
+      </w:pPr>
+      <w:rPr>
+        <w:rFonts w:ascii="Wingdings" w:hAnsi="Wingdings" w:hint="default"/>
+        <w:sz w:val="20"/>
+      </w:rPr>
+    </w:lvl>
+    <w:lvl w:ilvl="8" w:tentative="1">
+      <w:start w:val="1"/>
+      <w:numFmt w:val="bullet"/>
+      <w:lvlText w:val=""/>
+      <w:lvlJc w:val="left"/>
+      <w:pPr>
+        <w:tabs>
+          <w:tab w:val="num" w:pos="6480"/>
+        </w:tabs>
+        <w:ind w:left="6480" w:hanging="360"/>
+      </w:pPr>
+      <w:rPr>
+        <w:rFonts w:ascii="Wingdings" w:hAnsi="Wingdings" w:hint="default"/>
+        <w:sz w:val="20"/>
+      </w:rPr>
+    </w:lvl>
+  </w:abstractNum>
+  <w:abstractNum w:abstractNumId="2" w15:restartNumberingAfterBreak="0">
     <w:nsid w:val="40CB66A6"/>
     <w:multiLevelType w:val="hybridMultilevel"/>
     <w:tmpl w:val="84E83D42"/>
@@ -895,8 +1181,434 @@
       </w:rPr>
     </w:lvl>
   </w:abstractNum>
+  <w:abstractNum w:abstractNumId="3" w15:restartNumberingAfterBreak="0">
+    <w:nsid w:val="44355C00"/>
+    <w:multiLevelType w:val="multilevel"/>
+    <w:tmpl w:val="6CC88B72"/>
+    <w:lvl w:ilvl="0">
+      <w:start w:val="1"/>
+      <w:numFmt w:val="bullet"/>
+      <w:lvlText w:val=""/>
+      <w:lvlJc w:val="left"/>
+      <w:pPr>
+        <w:tabs>
+          <w:tab w:val="num" w:pos="720"/>
+        </w:tabs>
+        <w:ind w:left="720" w:hanging="360"/>
+      </w:pPr>
+      <w:rPr>
+        <w:rFonts w:ascii="Symbol" w:hAnsi="Symbol" w:hint="default"/>
+        <w:sz w:val="20"/>
+      </w:rPr>
+    </w:lvl>
+    <w:lvl w:ilvl="1" w:tentative="1">
+      <w:start w:val="1"/>
+      <w:numFmt w:val="bullet"/>
+      <w:lvlText w:val="o"/>
+      <w:lvlJc w:val="left"/>
+      <w:pPr>
+        <w:tabs>
+          <w:tab w:val="num" w:pos="1440"/>
+        </w:tabs>
+        <w:ind w:left="1440" w:hanging="360"/>
+      </w:pPr>
+      <w:rPr>
+        <w:rFonts w:ascii="Courier New" w:hAnsi="Courier New" w:hint="default"/>
+        <w:sz w:val="20"/>
+      </w:rPr>
+    </w:lvl>
+    <w:lvl w:ilvl="2" w:tentative="1">
+      <w:start w:val="1"/>
+      <w:numFmt w:val="bullet"/>
+      <w:lvlText w:val=""/>
+      <w:lvlJc w:val="left"/>
+      <w:pPr>
+        <w:tabs>
+          <w:tab w:val="num" w:pos="2160"/>
+        </w:tabs>
+        <w:ind w:left="2160" w:hanging="360"/>
+      </w:pPr>
+      <w:rPr>
+        <w:rFonts w:ascii="Wingdings" w:hAnsi="Wingdings" w:hint="default"/>
+        <w:sz w:val="20"/>
+      </w:rPr>
+    </w:lvl>
+    <w:lvl w:ilvl="3" w:tentative="1">
+      <w:start w:val="1"/>
+      <w:numFmt w:val="bullet"/>
+      <w:lvlText w:val=""/>
+      <w:lvlJc w:val="left"/>
+      <w:pPr>
+        <w:tabs>
+          <w:tab w:val="num" w:pos="2880"/>
+        </w:tabs>
+        <w:ind w:left="2880" w:hanging="360"/>
+      </w:pPr>
+      <w:rPr>
+        <w:rFonts w:ascii="Wingdings" w:hAnsi="Wingdings" w:hint="default"/>
+        <w:sz w:val="20"/>
+      </w:rPr>
+    </w:lvl>
+    <w:lvl w:ilvl="4" w:tentative="1">
+      <w:start w:val="1"/>
+      <w:numFmt w:val="bullet"/>
+      <w:lvlText w:val=""/>
+      <w:lvlJc w:val="left"/>
+      <w:pPr>
+        <w:tabs>
+          <w:tab w:val="num" w:pos="3600"/>
+        </w:tabs>
+        <w:ind w:left="3600" w:hanging="360"/>
+      </w:pPr>
+      <w:rPr>
+        <w:rFonts w:ascii="Wingdings" w:hAnsi="Wingdings" w:hint="default"/>
+        <w:sz w:val="20"/>
+      </w:rPr>
+    </w:lvl>
+    <w:lvl w:ilvl="5" w:tentative="1">
+      <w:start w:val="1"/>
+      <w:numFmt w:val="bullet"/>
+      <w:lvlText w:val=""/>
+      <w:lvlJc w:val="left"/>
+      <w:pPr>
+        <w:tabs>
+          <w:tab w:val="num" w:pos="4320"/>
+        </w:tabs>
+        <w:ind w:left="4320" w:hanging="360"/>
+      </w:pPr>
+      <w:rPr>
+        <w:rFonts w:ascii="Wingdings" w:hAnsi="Wingdings" w:hint="default"/>
+        <w:sz w:val="20"/>
+      </w:rPr>
+    </w:lvl>
+    <w:lvl w:ilvl="6" w:tentative="1">
+      <w:start w:val="1"/>
+      <w:numFmt w:val="bullet"/>
+      <w:lvlText w:val=""/>
+      <w:lvlJc w:val="left"/>
+      <w:pPr>
+        <w:tabs>
+          <w:tab w:val="num" w:pos="5040"/>
+        </w:tabs>
+        <w:ind w:left="5040" w:hanging="360"/>
+      </w:pPr>
+      <w:rPr>
+        <w:rFonts w:ascii="Wingdings" w:hAnsi="Wingdings" w:hint="default"/>
+        <w:sz w:val="20"/>
+      </w:rPr>
+    </w:lvl>
+    <w:lvl w:ilvl="7" w:tentative="1">
+      <w:start w:val="1"/>
+      <w:numFmt w:val="bullet"/>
+      <w:lvlText w:val=""/>
+      <w:lvlJc w:val="left"/>
+      <w:pPr>
+        <w:tabs>
+          <w:tab w:val="num" w:pos="5760"/>
+        </w:tabs>
+        <w:ind w:left="5760" w:hanging="360"/>
+      </w:pPr>
+      <w:rPr>
+        <w:rFonts w:ascii="Wingdings" w:hAnsi="Wingdings" w:hint="default"/>
+        <w:sz w:val="20"/>
+      </w:rPr>
+    </w:lvl>
+    <w:lvl w:ilvl="8" w:tentative="1">
+      <w:start w:val="1"/>
+      <w:numFmt w:val="bullet"/>
+      <w:lvlText w:val=""/>
+      <w:lvlJc w:val="left"/>
+      <w:pPr>
+        <w:tabs>
+          <w:tab w:val="num" w:pos="6480"/>
+        </w:tabs>
+        <w:ind w:left="6480" w:hanging="360"/>
+      </w:pPr>
+      <w:rPr>
+        <w:rFonts w:ascii="Wingdings" w:hAnsi="Wingdings" w:hint="default"/>
+        <w:sz w:val="20"/>
+      </w:rPr>
+    </w:lvl>
+  </w:abstractNum>
+  <w:abstractNum w:abstractNumId="4" w15:restartNumberingAfterBreak="0">
+    <w:nsid w:val="44C039D8"/>
+    <w:multiLevelType w:val="multilevel"/>
+    <w:tmpl w:val="81F653B6"/>
+    <w:lvl w:ilvl="0">
+      <w:start w:val="1"/>
+      <w:numFmt w:val="bullet"/>
+      <w:lvlText w:val=""/>
+      <w:lvlJc w:val="left"/>
+      <w:pPr>
+        <w:tabs>
+          <w:tab w:val="num" w:pos="720"/>
+        </w:tabs>
+        <w:ind w:left="720" w:hanging="360"/>
+      </w:pPr>
+      <w:rPr>
+        <w:rFonts w:ascii="Symbol" w:hAnsi="Symbol" w:hint="default"/>
+        <w:sz w:val="20"/>
+      </w:rPr>
+    </w:lvl>
+    <w:lvl w:ilvl="1" w:tentative="1">
+      <w:start w:val="1"/>
+      <w:numFmt w:val="bullet"/>
+      <w:lvlText w:val="o"/>
+      <w:lvlJc w:val="left"/>
+      <w:pPr>
+        <w:tabs>
+          <w:tab w:val="num" w:pos="1440"/>
+        </w:tabs>
+        <w:ind w:left="1440" w:hanging="360"/>
+      </w:pPr>
+      <w:rPr>
+        <w:rFonts w:ascii="Courier New" w:hAnsi="Courier New" w:hint="default"/>
+        <w:sz w:val="20"/>
+      </w:rPr>
+    </w:lvl>
+    <w:lvl w:ilvl="2" w:tentative="1">
+      <w:start w:val="1"/>
+      <w:numFmt w:val="bullet"/>
+      <w:lvlText w:val=""/>
+      <w:lvlJc w:val="left"/>
+      <w:pPr>
+        <w:tabs>
+          <w:tab w:val="num" w:pos="2160"/>
+        </w:tabs>
+        <w:ind w:left="2160" w:hanging="360"/>
+      </w:pPr>
+      <w:rPr>
+        <w:rFonts w:ascii="Wingdings" w:hAnsi="Wingdings" w:hint="default"/>
+        <w:sz w:val="20"/>
+      </w:rPr>
+    </w:lvl>
+    <w:lvl w:ilvl="3" w:tentative="1">
+      <w:start w:val="1"/>
+      <w:numFmt w:val="bullet"/>
+      <w:lvlText w:val=""/>
+      <w:lvlJc w:val="left"/>
+      <w:pPr>
+        <w:tabs>
+          <w:tab w:val="num" w:pos="2880"/>
+        </w:tabs>
+        <w:ind w:left="2880" w:hanging="360"/>
+      </w:pPr>
+      <w:rPr>
+        <w:rFonts w:ascii="Wingdings" w:hAnsi="Wingdings" w:hint="default"/>
+        <w:sz w:val="20"/>
+      </w:rPr>
+    </w:lvl>
+    <w:lvl w:ilvl="4" w:tentative="1">
+      <w:start w:val="1"/>
+      <w:numFmt w:val="bullet"/>
+      <w:lvlText w:val=""/>
+      <w:lvlJc w:val="left"/>
+      <w:pPr>
+        <w:tabs>
+          <w:tab w:val="num" w:pos="3600"/>
+        </w:tabs>
+        <w:ind w:left="3600" w:hanging="360"/>
+      </w:pPr>
+      <w:rPr>
+        <w:rFonts w:ascii="Wingdings" w:hAnsi="Wingdings" w:hint="default"/>
+        <w:sz w:val="20"/>
+      </w:rPr>
+    </w:lvl>
+    <w:lvl w:ilvl="5" w:tentative="1">
+      <w:start w:val="1"/>
+      <w:numFmt w:val="bullet"/>
+      <w:lvlText w:val=""/>
+      <w:lvlJc w:val="left"/>
+      <w:pPr>
+        <w:tabs>
+          <w:tab w:val="num" w:pos="4320"/>
+        </w:tabs>
+        <w:ind w:left="4320" w:hanging="360"/>
+      </w:pPr>
+      <w:rPr>
+        <w:rFonts w:ascii="Wingdings" w:hAnsi="Wingdings" w:hint="default"/>
+        <w:sz w:val="20"/>
+      </w:rPr>
+    </w:lvl>
+    <w:lvl w:ilvl="6" w:tentative="1">
+      <w:start w:val="1"/>
+      <w:numFmt w:val="bullet"/>
+      <w:lvlText w:val=""/>
+      <w:lvlJc w:val="left"/>
+      <w:pPr>
+        <w:tabs>
+          <w:tab w:val="num" w:pos="5040"/>
+        </w:tabs>
+        <w:ind w:left="5040" w:hanging="360"/>
+      </w:pPr>
+      <w:rPr>
+        <w:rFonts w:ascii="Wingdings" w:hAnsi="Wingdings" w:hint="default"/>
+        <w:sz w:val="20"/>
+      </w:rPr>
+    </w:lvl>
+    <w:lvl w:ilvl="7" w:tentative="1">
+      <w:start w:val="1"/>
+      <w:numFmt w:val="bullet"/>
+      <w:lvlText w:val=""/>
+      <w:lvlJc w:val="left"/>
+      <w:pPr>
+        <w:tabs>
+          <w:tab w:val="num" w:pos="5760"/>
+        </w:tabs>
+        <w:ind w:left="5760" w:hanging="360"/>
+      </w:pPr>
+      <w:rPr>
+        <w:rFonts w:ascii="Wingdings" w:hAnsi="Wingdings" w:hint="default"/>
+        <w:sz w:val="20"/>
+      </w:rPr>
+    </w:lvl>
+    <w:lvl w:ilvl="8" w:tentative="1">
+      <w:start w:val="1"/>
+      <w:numFmt w:val="bullet"/>
+      <w:lvlText w:val=""/>
+      <w:lvlJc w:val="left"/>
+      <w:pPr>
+        <w:tabs>
+          <w:tab w:val="num" w:pos="6480"/>
+        </w:tabs>
+        <w:ind w:left="6480" w:hanging="360"/>
+      </w:pPr>
+      <w:rPr>
+        <w:rFonts w:ascii="Wingdings" w:hAnsi="Wingdings" w:hint="default"/>
+        <w:sz w:val="20"/>
+      </w:rPr>
+    </w:lvl>
+  </w:abstractNum>
+  <w:abstractNum w:abstractNumId="5" w15:restartNumberingAfterBreak="0">
+    <w:nsid w:val="560A7F64"/>
+    <w:multiLevelType w:val="hybridMultilevel"/>
+    <w:tmpl w:val="C62C2702"/>
+    <w:lvl w:ilvl="0" w:tplc="04090001">
+      <w:start w:val="1"/>
+      <w:numFmt w:val="bullet"/>
+      <w:lvlText w:val=""/>
+      <w:lvlJc w:val="left"/>
+      <w:pPr>
+        <w:ind w:left="720" w:hanging="360"/>
+      </w:pPr>
+      <w:rPr>
+        <w:rFonts w:ascii="Symbol" w:hAnsi="Symbol" w:hint="default"/>
+      </w:rPr>
+    </w:lvl>
+    <w:lvl w:ilvl="1" w:tplc="04090003" w:tentative="1">
+      <w:start w:val="1"/>
+      <w:numFmt w:val="bullet"/>
+      <w:lvlText w:val="o"/>
+      <w:lvlJc w:val="left"/>
+      <w:pPr>
+        <w:ind w:left="1440" w:hanging="360"/>
+      </w:pPr>
+      <w:rPr>
+        <w:rFonts w:ascii="Courier New" w:hAnsi="Courier New" w:cs="Courier New" w:hint="default"/>
+      </w:rPr>
+    </w:lvl>
+    <w:lvl w:ilvl="2" w:tplc="04090005" w:tentative="1">
+      <w:start w:val="1"/>
+      <w:numFmt w:val="bullet"/>
+      <w:lvlText w:val=""/>
+      <w:lvlJc w:val="left"/>
+      <w:pPr>
+        <w:ind w:left="2160" w:hanging="360"/>
+      </w:pPr>
+      <w:rPr>
+        <w:rFonts w:ascii="Wingdings" w:hAnsi="Wingdings" w:hint="default"/>
+      </w:rPr>
+    </w:lvl>
+    <w:lvl w:ilvl="3" w:tplc="04090001" w:tentative="1">
+      <w:start w:val="1"/>
+      <w:numFmt w:val="bullet"/>
+      <w:lvlText w:val=""/>
+      <w:lvlJc w:val="left"/>
+      <w:pPr>
+        <w:ind w:left="2880" w:hanging="360"/>
+      </w:pPr>
+      <w:rPr>
+        <w:rFonts w:ascii="Symbol" w:hAnsi="Symbol" w:hint="default"/>
+      </w:rPr>
+    </w:lvl>
+    <w:lvl w:ilvl="4" w:tplc="04090003" w:tentative="1">
+      <w:start w:val="1"/>
+      <w:numFmt w:val="bullet"/>
+      <w:lvlText w:val="o"/>
+      <w:lvlJc w:val="left"/>
+      <w:pPr>
+        <w:ind w:left="3600" w:hanging="360"/>
+      </w:pPr>
+      <w:rPr>
+        <w:rFonts w:ascii="Courier New" w:hAnsi="Courier New" w:cs="Courier New" w:hint="default"/>
+      </w:rPr>
+    </w:lvl>
+    <w:lvl w:ilvl="5" w:tplc="04090005" w:tentative="1">
+      <w:start w:val="1"/>
+      <w:numFmt w:val="bullet"/>
+      <w:lvlText w:val=""/>
+      <w:lvlJc w:val="left"/>
+      <w:pPr>
+        <w:ind w:left="4320" w:hanging="360"/>
+      </w:pPr>
+      <w:rPr>
+        <w:rFonts w:ascii="Wingdings" w:hAnsi="Wingdings" w:hint="default"/>
+      </w:rPr>
+    </w:lvl>
+    <w:lvl w:ilvl="6" w:tplc="04090001" w:tentative="1">
+      <w:start w:val="1"/>
+      <w:numFmt w:val="bullet"/>
+      <w:lvlText w:val=""/>
+      <w:lvlJc w:val="left"/>
+      <w:pPr>
+        <w:ind w:left="5040" w:hanging="360"/>
+      </w:pPr>
+      <w:rPr>
+        <w:rFonts w:ascii="Symbol" w:hAnsi="Symbol" w:hint="default"/>
+      </w:rPr>
+    </w:lvl>
+    <w:lvl w:ilvl="7" w:tplc="04090003" w:tentative="1">
+      <w:start w:val="1"/>
+      <w:numFmt w:val="bullet"/>
+      <w:lvlText w:val="o"/>
+      <w:lvlJc w:val="left"/>
+      <w:pPr>
+        <w:ind w:left="5760" w:hanging="360"/>
+      </w:pPr>
+      <w:rPr>
+        <w:rFonts w:ascii="Courier New" w:hAnsi="Courier New" w:cs="Courier New" w:hint="default"/>
+      </w:rPr>
+    </w:lvl>
+    <w:lvl w:ilvl="8" w:tplc="04090005" w:tentative="1">
+      <w:start w:val="1"/>
+      <w:numFmt w:val="bullet"/>
+      <w:lvlText w:val=""/>
+      <w:lvlJc w:val="left"/>
+      <w:pPr>
+        <w:ind w:left="6480" w:hanging="360"/>
+      </w:pPr>
+      <w:rPr>
+        <w:rFonts w:ascii="Wingdings" w:hAnsi="Wingdings" w:hint="default"/>
+      </w:rPr>
+    </w:lvl>
+  </w:abstractNum>
   <w:num w:numId="1" w16cid:durableId="2126344467">
+    <w:abstractNumId w:val="2"/>
+  </w:num>
+  <w:num w:numId="2" w16cid:durableId="462116299">
+    <w:abstractNumId w:val="3"/>
+  </w:num>
+  <w:num w:numId="3" w16cid:durableId="226767948">
     <w:abstractNumId w:val="0"/>
+  </w:num>
+  <w:num w:numId="4" w16cid:durableId="1740129778">
+    <w:abstractNumId w:val="4"/>
+  </w:num>
+  <w:num w:numId="5" w16cid:durableId="37708361">
+    <w:abstractNumId w:val="5"/>
+  </w:num>
+  <w:num w:numId="6" w16cid:durableId="1388913958">
+    <w:abstractNumId w:val="1"/>
   </w:num>
 </w:numbering>
 </file>
@@ -1504,7 +2216,6 @@
   <w:style w:type="character" w:default="1" w:styleId="DefaultParagraphFont">
     <w:name w:val="Default Paragraph Font"/>
     <w:uiPriority w:val="1"/>
-    <w:semiHidden/>
     <w:unhideWhenUsed/>
   </w:style>
   <w:style w:type="table" w:default="1" w:styleId="TableNormal">

</xml_diff>